<commit_message>
fix: CFMP podcast — replace Costco brand reference with warehouse-club
</commit_message>
<xml_diff>
--- a/docs/book/APEX-Sellers-Guide-Runtime-Addendum.docx
+++ b/docs/book/APEX-Sellers-Guide-Runtime-Addendum.docx
@@ -1539,6 +1539,193 @@
         <w:t xml:space="preserve">End of addendum. For questions, contact the APEX authoring team.</w:t>
       </w:r>
     </w:p>
+    <w:p>
+      <w:r>
+        <w:br w:type="page"/>
+      </w:r>
+    </w:p>
+    <w:p>
+      <w:r>
+        <w:t>CFMP v0.2 Addendum — 7th Industry Solution Pack</w:t>
+      </w:r>
+    </w:p>
+    <w:p>
+      <w:r>
+        <w:t>Inserted 2026-05-23. APEX-M now ships seven Industry Solution Packs with Customer Focused Merchandise (CFMP) v0.2 — the first Pack organized around a customer-moment spine. Phase 1 live on APEX-M dev substrate today.</w:t>
+      </w:r>
+    </w:p>
+    <w:p>
+      <w:r>
+        <w:t>New Virtual Views</w:t>
+      </w:r>
+    </w:p>
+    <w:p>
+      <w:pPr>
+        <w:pStyle w:val="ListParagraph"/>
+      </w:pPr>
+      <w:r>
+        <w:t>merml.product_with_planogram_location — Per-SKU shelf location joined from MERML.Product × CFMP.StoreMap. Refreshed nightly from the planogram feed; drives the agent's route_to_product tool.</w:t>
+      </w:r>
+    </w:p>
+    <w:p>
+      <w:pPr>
+        <w:pStyle w:val="ListParagraph"/>
+      </w:pPr>
+      <w:r>
+        <w:t>merml.osa_by_aisle — On-shelf availability rolled up by aisle. Combines POS velocity, inventory position, and Vision AI Dev Kit shelf-void detections. Feeds OSA / shelf-gap-restock-dispatch scenarios.</w:t>
+      </w:r>
+    </w:p>
+    <w:p>
+      <w:pPr>
+        <w:pStyle w:val="ListParagraph"/>
+      </w:pPr>
+      <w:r>
+        <w:t>cxml.customer_session_with_route — Active customer phone session enriched with the most recent wayfinding route + current graph node. Backs the customer_phone Adaptive Card transport.</w:t>
+      </w:r>
+    </w:p>
+    <w:p>
+      <w:pPr>
+        <w:pStyle w:val="ListParagraph"/>
+      </w:pPr>
+      <w:r>
+        <w:t>cxml.cart_dwell_event — Cart-stationary &gt;5min outside checkout zone event stream. Triggers cart-dwell-abandonment-rescue dispatches via Teams cards to the nearest associate.</w:t>
+      </w:r>
+    </w:p>
+    <w:p>
+      <w:pPr>
+        <w:pStyle w:val="ListParagraph"/>
+      </w:pPr>
+      <w:r>
+        <w:t>cxml.dietary_profile — Customer's active dietary preferences (loyalty-bound; consent-gated). Read by the proactive associate to flag conflicts and propose compliant alternatives.</w:t>
+      </w:r>
+    </w:p>
+    <w:p>
+      <w:pPr>
+        <w:pStyle w:val="ListParagraph"/>
+      </w:pPr>
+      <w:r>
+        <w:t>cfmp.storemap_view — Thin overlay binding the retailer store_id to the Azure Maps Creator Dataset ID + Stateset ID + nightly SKU↔unit_id table. Pack-level manifest captured once per store, refreshed on remodel.</w:t>
+      </w:r>
+    </w:p>
+    <w:p>
+      <w:r>
+        <w:t>Core extensions</w:t>
+      </w:r>
+    </w:p>
+    <w:p>
+      <w:pPr>
+        <w:pStyle w:val="ListParagraph"/>
+      </w:pPr>
+      <w:r>
+        <w:t>New persona type `customer` — loyalty-ID-bound, consent-gated, channel = customer_phone. Reusable across all customer-facing Packs.</w:t>
+      </w:r>
+    </w:p>
+    <w:p>
+      <w:pPr>
+        <w:pStyle w:val="ListParagraph"/>
+      </w:pPr>
+      <w:r>
+        <w:t>New HITL transport `customer_phone` extending interface #9. APEX-M binding: Azure Notification Hubs.</w:t>
+      </w:r>
+    </w:p>
+    <w:p>
+      <w:pPr>
+        <w:pStyle w:val="ListParagraph"/>
+      </w:pPr>
+      <w:r>
+        <w:t>Proposed Interface #15 — Maps &amp; Wayfinding. APEX-M binding: Azure Maps Creator (Indoor Maps + Wayfinding REST + Web SDK).</w:t>
+      </w:r>
+    </w:p>
+    <w:p>
+      <w:r>
+        <w:t>Phase 1 live status</w:t>
+      </w:r>
+    </w:p>
+    <w:p>
+      <w:pPr>
+        <w:pStyle w:val="ListParagraph"/>
+      </w:pPr>
+      <w:r>
+        <w:t>Vendored apex_core + apex_audit + apex_purview in the orchestrator container.</w:t>
+      </w:r>
+    </w:p>
+    <w:p>
+      <w:pPr>
+        <w:pStyle w:val="ListParagraph"/>
+      </w:pPr>
+      <w:r>
+        <w:t>Signed 14-field LedgerRow per /agent/ask with HMAC-SHA256 chain and three-version stamps.</w:t>
+      </w:r>
+    </w:p>
+    <w:p>
+      <w:pPr>
+        <w:pStyle w:val="ListParagraph"/>
+      </w:pPr>
+      <w:r>
+        <w:t>Atlas-shaped Purview lineage edges (mcp→agent, agent→orchestration, orchestration→audit) buffered offline.</w:t>
+      </w:r>
+    </w:p>
+    <w:p>
+      <w:pPr>
+        <w:pStyle w:val="ListParagraph"/>
+      </w:pPr>
+      <w:r>
+        <w:t>Microsoft Agent Framework 1.6.0 (GA) with provider toggle (Azure OpenAI / Anthropic).</w:t>
+      </w:r>
+    </w:p>
+    <w:p>
+      <w:pPr>
+        <w:pStyle w:val="ListParagraph"/>
+      </w:pPr>
+      <w:r>
+        <w:t>Azure Speech (en-US-AvaMultilingualNeural) STT + TTS via /agent/tts.</w:t>
+      </w:r>
+    </w:p>
+    <w:p>
+      <w:pPr>
+        <w:pStyle w:val="ListParagraph"/>
+      </w:pPr>
+      <w:r>
+        <w:t>HITL consent gate at $50 cart-add.</w:t>
+      </w:r>
+    </w:p>
+    <w:p>
+      <w:r>
+        <w:t>Companion artifacts</w:t>
+      </w:r>
+    </w:p>
+    <w:p>
+      <w:pPr>
+        <w:pStyle w:val="ListParagraph"/>
+      </w:pPr>
+      <w:r>
+        <w:t>docs/packs/CFMP-v0.2.md — Pack design (12 sections)</w:t>
+      </w:r>
+    </w:p>
+    <w:p>
+      <w:pPr>
+        <w:pStyle w:val="ListParagraph"/>
+      </w:pPr>
+      <w:r>
+        <w:t>docs/packs/CFMP-Scenario-Chains-v0.2.xlsx — 18-scenario workbook</w:t>
+      </w:r>
+    </w:p>
+    <w:p>
+      <w:pPr>
+        <w:pStyle w:val="ListParagraph"/>
+      </w:pPr>
+      <w:r>
+        <w:t>docs/packs/APEX-Architecture-v5.1-with-CFMP-chapter.docx — parent arch doc + Chapter 26</w:t>
+      </w:r>
+    </w:p>
+    <w:p>
+      <w:pPr>
+        <w:pStyle w:val="ListParagraph"/>
+      </w:pPr>
+      <w:r>
+        <w:t>Live demo: https://ca-visionkit-portal.gentlestone-9b49b099.eastus2.azurecontainerapps.io/architecture</w:t>
+      </w:r>
+    </w:p>
     <w:sectPr>
       <w:pgSz w:w="12240" w:h="15840" w:orient="portrait"/>
       <w:pgMar w:top="1440" w:right="1440" w:bottom="1440" w:left="1440" w:header="708" w:footer="708" w:gutter="0"/>

</xml_diff>